<commit_message>
Vacance 2025 par ville ACV extraite de l'atlas ANCT, typologie des villes ; correction Creil
Détection des points de la carte de vacance (atlas ANCT T4 2025, p. 23)
et rattachement aux communes ACV ; typologie croisant Sirene, vacance
2025 et palmarès FACT/Codata. Creil est en tranche 10-15 % (et non
5-10 %) : proposition DGE corrigée.

Co-Authored-By: Claude Opus 5.5 <noreply@anthropic.com>
Claude-Session: https://claude.ai/code/session_01C7XiPcXpETUWAHMH28sD58
</commit_message>
<xml_diff>
--- a/note_politique/propositions_missions_entretiens_ACV_DGE.docx
+++ b/note_politique/propositions_missions_entretiens_ACV_DGE.docx
@@ -172,7 +172,7 @@
         <w:spacing w:after="120" w:line="276"/>
       </w:pPr>
       <w:r>
-        <w:t xml:space="preserve">Quatre villes montrent une inversion confirmée par une vacance basse en 2025 ; deux autres ont fortement freiné leur déclin. Les commerces sont les commerces employeurs du centre-ville en 2012, 2019 et 2025.</w:t>
+        <w:t xml:space="preserve">Trois villes montrent une inversion confirmée par une vacance basse en 2025 (5 à 10 %) ; Creil et Denain rebondissent avec une vacance moyenne ; Vierzon a freiné son déclin. Les commerces sont les commerces employeurs du centre-ville en 2012, 2019 et 2025.</w:t>
       </w:r>
     </w:p>
     <w:tbl>
@@ -811,7 +811,7 @@
                 <w:sz w:val="17"/>
                 <w:szCs w:val="17"/>
               </w:rPr>
-              <w:t xml:space="preserve">5 à 10 % en 2025</w:t>
+              <w:t xml:space="preserve">10 à 15 % en 2025</w:t>
             </w:r>
           </w:p>
         </w:tc>
@@ -2626,7 +2626,7 @@
       <w:r>
         <w:t xml:space="preserve">Insee, base Sirene et géolocalisation des établissements (2012-2025), calculs de l'auteur ; liste des villes ACV : </w:t>
       </w:r>
-      <w:hyperlink w:history="1" r:id="rIdkxht4ld3fru426k7zpkqt">
+      <w:hyperlink w:history="1" r:id="rIdo95axrypq4652jbus5tsc">
         <w:r>
           <w:rPr>
             <w:rStyle w:val="Hyperlink"/>
@@ -2644,7 +2644,7 @@
         </w:numPr>
         <w:spacing w:after="70"/>
       </w:pPr>
-      <w:hyperlink w:history="1" r:id="rId4-2wss-oqmleraewvfv8i">
+      <w:hyperlink w:history="1" r:id="rIdtgachf_hceza8rcie7qps">
         <w:r>
           <w:rPr>
             <w:rStyle w:val="Hyperlink"/>
@@ -2665,7 +2665,7 @@
         </w:numPr>
         <w:spacing w:after="70"/>
       </w:pPr>
-      <w:hyperlink w:history="1" r:id="rIdnnsyeyz8mplnpenyfsypl">
+      <w:hyperlink w:history="1" r:id="rIdbgubgw1pysyhxdiveuduw">
         <w:r>
           <w:rPr>
             <w:rStyle w:val="Hyperlink"/>
@@ -2686,7 +2686,7 @@
         </w:numPr>
         <w:spacing w:after="70"/>
       </w:pPr>
-      <w:hyperlink w:history="1" r:id="rId45bmasy-1pq8xbt0ykhun">
+      <w:hyperlink w:history="1" r:id="rId2nud-iakprmg-m3_i3ekw">
         <w:r>
           <w:rPr>
             <w:rStyle w:val="Hyperlink"/>

</xml_diff>